<commit_message>
docs: auto-generate sample.docx from sample.md
</commit_message>
<xml_diff>
--- a/sample.docx
+++ b/sample.docx
@@ -28,7 +28,7 @@
         </w:p>
       </w:sdtContent>
     </w:sdt>
-    <w:bookmarkStart w:id="21" w:name="professional-report-template"/>
+    <w:bookmarkStart w:id="32" w:name="professional-report-template"/>
     <w:p>
       <w:pPr>
         <w:pStyle w:val="Heading1"/>
@@ -52,40 +52,40 @@
       </w:pPr>
       <w:r>
         <w:rPr>
+          <w:bCs/>
           <w:b/>
+        </w:rPr>
+        <w:t xml:space="preserve">Author:</w:t>
+      </w:r>
+      <w:r>
+        <w:t xml:space="preserve"> </w:t>
+      </w:r>
+      <w:r>
+        <w:t xml:space="preserve">John Doe</w:t>
+      </w:r>
+      <w:r>
+        <w:br/>
+      </w:r>
+      <w:r>
+        <w:rPr>
           <w:bCs/>
-        </w:rPr>
-        <w:t xml:space="preserve">Author:</w:t>
+          <w:b/>
+        </w:rPr>
+        <w:t xml:space="preserve">Date:</w:t>
       </w:r>
       <w:r>
         <w:t xml:space="preserve"> </w:t>
       </w:r>
       <w:r>
-        <w:t xml:space="preserve">John Doe</w:t>
+        <w:t xml:space="preserve">April 1, 2026</w:t>
       </w:r>
       <w:r>
         <w:br/>
       </w:r>
       <w:r>
         <w:rPr>
+          <w:bCs/>
           <w:b/>
-          <w:bCs/>
-        </w:rPr>
-        <w:t xml:space="preserve">Date:</w:t>
-      </w:r>
-      <w:r>
-        <w:t xml:space="preserve"> </w:t>
-      </w:r>
-      <w:r>
-        <w:t xml:space="preserve">April 1, 2026</w:t>
-      </w:r>
-      <w:r>
-        <w:br/>
-      </w:r>
-      <w:r>
-        <w:rPr>
-          <w:b/>
-          <w:bCs/>
         </w:rPr>
         <w:t xml:space="preserve">Subject:</w:t>
       </w:r>
@@ -103,7 +103,7 @@
         </w:pict>
       </w:r>
     </w:p>
-    <w:bookmarkStart w:id="9" w:name="table-of-contents"/>
+    <w:bookmarkStart w:id="20" w:name="table-of-contents"/>
     <w:p>
       <w:pPr>
         <w:pStyle w:val="Heading2"/>
@@ -123,11 +123,11 @@
     </w:p>
     <w:p>
       <w:pPr>
-        <w:pStyle w:val="Compact"/>
         <w:numPr>
           <w:ilvl w:val="0"/>
           <w:numId w:val="1001"/>
         </w:numPr>
+        <w:pStyle w:val="Compact"/>
       </w:pPr>
       <w:hyperlink w:anchor="introduction">
         <w:r>
@@ -140,11 +140,11 @@
     </w:p>
     <w:p>
       <w:pPr>
-        <w:pStyle w:val="Compact"/>
         <w:numPr>
           <w:ilvl w:val="0"/>
           <w:numId w:val="1001"/>
         </w:numPr>
+        <w:pStyle w:val="Compact"/>
       </w:pPr>
       <w:hyperlink w:anchor="background">
         <w:r>
@@ -157,11 +157,11 @@
     </w:p>
     <w:p>
       <w:pPr>
-        <w:pStyle w:val="Compact"/>
         <w:numPr>
           <w:ilvl w:val="0"/>
           <w:numId w:val="1001"/>
         </w:numPr>
+        <w:pStyle w:val="Compact"/>
       </w:pPr>
       <w:hyperlink w:anchor="key-findings">
         <w:r>
@@ -174,11 +174,11 @@
     </w:p>
     <w:p>
       <w:pPr>
-        <w:pStyle w:val="Compact"/>
         <w:numPr>
           <w:ilvl w:val="0"/>
           <w:numId w:val="1001"/>
         </w:numPr>
+        <w:pStyle w:val="Compact"/>
       </w:pPr>
       <w:hyperlink w:anchor="recommendations">
         <w:r>
@@ -191,11 +191,11 @@
     </w:p>
     <w:p>
       <w:pPr>
-        <w:pStyle w:val="Compact"/>
         <w:numPr>
           <w:ilvl w:val="0"/>
           <w:numId w:val="1001"/>
         </w:numPr>
+        <w:pStyle w:val="Compact"/>
       </w:pPr>
       <w:hyperlink w:anchor="conclusion">
         <w:r>
@@ -213,8 +213,8 @@
         </w:pict>
       </w:r>
     </w:p>
-    <w:bookmarkEnd w:id="9"/>
-    <w:bookmarkStart w:id="10" w:name="introduction"/>
+    <w:bookmarkEnd w:id="20"/>
+    <w:bookmarkStart w:id="21" w:name="introduction"/>
     <w:p>
       <w:pPr>
         <w:pStyle w:val="Heading2"/>
@@ -240,8 +240,8 @@
         <w:t xml:space="preserve">This document demonstrates a professional markdown file that can be converted to MS Word format (.docx) using pandoc. It includes various formatting elements commonly used in business documents.</w:t>
       </w:r>
     </w:p>
-    <w:bookmarkEnd w:id="10"/>
-    <w:bookmarkStart w:id="12" w:name="background"/>
+    <w:bookmarkEnd w:id="21"/>
+    <w:bookmarkStart w:id="23" w:name="background"/>
     <w:p>
       <w:pPr>
         <w:pStyle w:val="Heading2"/>
@@ -269,11 +269,11 @@
     </w:p>
     <w:p>
       <w:pPr>
-        <w:pStyle w:val="Compact"/>
         <w:numPr>
           <w:ilvl w:val="0"/>
           <w:numId w:val="1002"/>
         </w:numPr>
+        <w:pStyle w:val="Compact"/>
       </w:pPr>
       <w:r>
         <w:t xml:space="preserve">Microsoft Word (.docx)</w:t>
@@ -281,11 +281,11 @@
     </w:p>
     <w:p>
       <w:pPr>
-        <w:pStyle w:val="Compact"/>
         <w:numPr>
           <w:ilvl w:val="0"/>
           <w:numId w:val="1002"/>
         </w:numPr>
+        <w:pStyle w:val="Compact"/>
       </w:pPr>
       <w:r>
         <w:t xml:space="preserve">PDF (.pdf)</w:t>
@@ -293,11 +293,11 @@
     </w:p>
     <w:p>
       <w:pPr>
-        <w:pStyle w:val="Compact"/>
         <w:numPr>
           <w:ilvl w:val="0"/>
           <w:numId w:val="1002"/>
         </w:numPr>
+        <w:pStyle w:val="Compact"/>
       </w:pPr>
       <w:r>
         <w:t xml:space="preserve">HTML (.html)</w:t>
@@ -305,17 +305,17 @@
     </w:p>
     <w:p>
       <w:pPr>
-        <w:pStyle w:val="Compact"/>
         <w:numPr>
           <w:ilvl w:val="0"/>
           <w:numId w:val="1002"/>
         </w:numPr>
+        <w:pStyle w:val="Compact"/>
       </w:pPr>
       <w:r>
         <w:t xml:space="preserve">PowerPoint (.pptx)</w:t>
       </w:r>
     </w:p>
-    <w:bookmarkStart w:id="11" w:name="key-benefits"/>
+    <w:bookmarkStart w:id="22" w:name="key-benefits"/>
     <w:p>
       <w:pPr>
         <w:pStyle w:val="Heading3"/>
@@ -335,73 +335,73 @@
     </w:p>
     <w:p>
       <w:pPr>
-        <w:pStyle w:val="Compact"/>
         <w:numPr>
           <w:ilvl w:val="0"/>
           <w:numId w:val="1003"/>
         </w:numPr>
-      </w:pPr>
-      <w:r>
-        <w:rPr>
+        <w:pStyle w:val="Compact"/>
+      </w:pPr>
+      <w:r>
+        <w:rPr>
+          <w:bCs/>
           <w:b/>
+        </w:rPr>
+        <w:t xml:space="preserve">Plain text format</w:t>
+      </w:r>
+      <w:r>
+        <w:t xml:space="preserve">: Easy to version control and collaborate</w:t>
+      </w:r>
+    </w:p>
+    <w:p>
+      <w:pPr>
+        <w:numPr>
+          <w:ilvl w:val="0"/>
+          <w:numId w:val="1003"/>
+        </w:numPr>
+        <w:pStyle w:val="Compact"/>
+      </w:pPr>
+      <w:r>
+        <w:rPr>
           <w:bCs/>
-        </w:rPr>
-        <w:t xml:space="preserve">Plain text format</w:t>
-      </w:r>
-      <w:r>
-        <w:t xml:space="preserve">: Easy to version control and collaborate</w:t>
-      </w:r>
-    </w:p>
-    <w:p>
-      <w:pPr>
-        <w:pStyle w:val="Compact"/>
+          <w:b/>
+        </w:rPr>
+        <w:t xml:space="preserve">Universal conversion</w:t>
+      </w:r>
+      <w:r>
+        <w:t xml:space="preserve">: Works across multiple platforms</w:t>
+      </w:r>
+    </w:p>
+    <w:p>
+      <w:pPr>
         <w:numPr>
           <w:ilvl w:val="0"/>
           <w:numId w:val="1003"/>
         </w:numPr>
-      </w:pPr>
-      <w:r>
-        <w:rPr>
+        <w:pStyle w:val="Compact"/>
+      </w:pPr>
+      <w:r>
+        <w:rPr>
+          <w:bCs/>
           <w:b/>
+        </w:rPr>
+        <w:t xml:space="preserve">Professional output</w:t>
+      </w:r>
+      <w:r>
+        <w:t xml:space="preserve">: Generates properly formatted documents</w:t>
+      </w:r>
+    </w:p>
+    <w:p>
+      <w:pPr>
+        <w:numPr>
+          <w:ilvl w:val="0"/>
+          <w:numId w:val="1003"/>
+        </w:numPr>
+        <w:pStyle w:val="Compact"/>
+      </w:pPr>
+      <w:r>
+        <w:rPr>
           <w:bCs/>
-        </w:rPr>
-        <w:t xml:space="preserve">Universal conversion</w:t>
-      </w:r>
-      <w:r>
-        <w:t xml:space="preserve">: Works across multiple platforms</w:t>
-      </w:r>
-    </w:p>
-    <w:p>
-      <w:pPr>
-        <w:pStyle w:val="Compact"/>
-        <w:numPr>
-          <w:ilvl w:val="0"/>
-          <w:numId w:val="1003"/>
-        </w:numPr>
-      </w:pPr>
-      <w:r>
-        <w:rPr>
           <w:b/>
-          <w:bCs/>
-        </w:rPr>
-        <w:t xml:space="preserve">Professional output</w:t>
-      </w:r>
-      <w:r>
-        <w:t xml:space="preserve">: Generates properly formatted documents</w:t>
-      </w:r>
-    </w:p>
-    <w:p>
-      <w:pPr>
-        <w:pStyle w:val="Compact"/>
-        <w:numPr>
-          <w:ilvl w:val="0"/>
-          <w:numId w:val="1003"/>
-        </w:numPr>
-      </w:pPr>
-      <w:r>
-        <w:rPr>
-          <w:b/>
-          <w:bCs/>
         </w:rPr>
         <w:t xml:space="preserve">Automation-friendly</w:t>
       </w:r>
@@ -409,9 +409,9 @@
         <w:t xml:space="preserve">: Integrate into CI/CD pipelines</w:t>
       </w:r>
     </w:p>
-    <w:bookmarkEnd w:id="11"/>
-    <w:bookmarkEnd w:id="12"/>
-    <w:bookmarkStart w:id="16" w:name="key-findings"/>
+    <w:bookmarkEnd w:id="22"/>
+    <w:bookmarkEnd w:id="23"/>
+    <w:bookmarkStart w:id="27" w:name="key-findings"/>
     <w:p>
       <w:pPr>
         <w:pStyle w:val="Heading2"/>
@@ -437,7 +437,7 @@
         <w:t xml:space="preserve">Our analysis reveals the following important findings:</w:t>
       </w:r>
     </w:p>
-    <w:bookmarkStart w:id="13" w:name="finding-1-efficiency-gains"/>
+    <w:bookmarkStart w:id="24" w:name="finding-1-efficiency-gains"/>
     <w:p>
       <w:pPr>
         <w:pStyle w:val="Heading3"/>
@@ -465,11 +465,11 @@
     </w:p>
     <w:p>
       <w:pPr>
-        <w:pStyle w:val="Compact"/>
         <w:numPr>
           <w:ilvl w:val="0"/>
           <w:numId w:val="1004"/>
         </w:numPr>
+        <w:pStyle w:val="Compact"/>
       </w:pPr>
       <w:r>
         <w:t xml:space="preserve">Write content once</w:t>
@@ -477,11 +477,11 @@
     </w:p>
     <w:p>
       <w:pPr>
-        <w:pStyle w:val="Compact"/>
         <w:numPr>
           <w:ilvl w:val="0"/>
           <w:numId w:val="1004"/>
         </w:numPr>
+        <w:pStyle w:val="Compact"/>
       </w:pPr>
       <w:r>
         <w:t xml:space="preserve">Generate multiple output formats</w:t>
@@ -489,11 +489,11 @@
     </w:p>
     <w:p>
       <w:pPr>
-        <w:pStyle w:val="Compact"/>
         <w:numPr>
           <w:ilvl w:val="0"/>
           <w:numId w:val="1004"/>
         </w:numPr>
+        <w:pStyle w:val="Compact"/>
       </w:pPr>
       <w:r>
         <w:t xml:space="preserve">Maintain version history</w:t>
@@ -501,18 +501,18 @@
     </w:p>
     <w:p>
       <w:pPr>
-        <w:pStyle w:val="Compact"/>
         <w:numPr>
           <w:ilvl w:val="0"/>
           <w:numId w:val="1004"/>
         </w:numPr>
+        <w:pStyle w:val="Compact"/>
       </w:pPr>
       <w:r>
         <w:t xml:space="preserve">Reduce formatting time by 60%</w:t>
       </w:r>
     </w:p>
-    <w:bookmarkEnd w:id="13"/>
-    <w:bookmarkStart w:id="14" w:name="finding-2-cost-reduction"/>
+    <w:bookmarkEnd w:id="24"/>
+    <w:bookmarkStart w:id="25" w:name="finding-2-cost-reduction"/>
     <w:p>
       <w:pPr>
         <w:pStyle w:val="Heading3"/>
@@ -535,6 +535,7 @@
         <w:tblStyle w:val="Table"/>
         <w:tblW w:type="auto" w:w="0"/>
         <w:tblLook w:firstRow="1" w:lastRow="0" w:firstColumn="0" w:lastColumn="0" w:noHBand="0" w:noVBand="0" w:val="0020"/>
+        <w:jc w:val="start"/>
       </w:tblPr>
       <w:tblGrid>
         <w:gridCol w:w="2640"/>
@@ -543,13 +544,14 @@
       </w:tblGrid>
       <w:tr>
         <w:trPr>
-          <w:tblHeader w:val="on"/>
+          <w:tblHeader w:val="true"/>
         </w:trPr>
         <w:tc>
           <w:tcPr/>
           <w:p>
             <w:pPr>
               <w:pStyle w:val="Compact"/>
+              <w:jc w:val="left"/>
             </w:pPr>
             <w:r>
               <w:t xml:space="preserve">Aspect</w:t>
@@ -561,6 +563,7 @@
           <w:p>
             <w:pPr>
               <w:pStyle w:val="Compact"/>
+              <w:jc w:val="left"/>
             </w:pPr>
             <w:r>
               <w:t xml:space="preserve">Traditional</w:t>
@@ -572,6 +575,7 @@
           <w:p>
             <w:pPr>
               <w:pStyle w:val="Compact"/>
+              <w:jc w:val="left"/>
             </w:pPr>
             <w:r>
               <w:t xml:space="preserve">Markdown Approach</w:t>
@@ -585,6 +589,7 @@
           <w:p>
             <w:pPr>
               <w:pStyle w:val="Compact"/>
+              <w:jc w:val="left"/>
             </w:pPr>
             <w:r>
               <w:t xml:space="preserve">Tool cost</w:t>
@@ -596,6 +601,7 @@
           <w:p>
             <w:pPr>
               <w:pStyle w:val="Compact"/>
+              <w:jc w:val="left"/>
             </w:pPr>
             <w:r>
               <w:t xml:space="preserve">High ($$$)</w:t>
@@ -607,6 +613,7 @@
           <w:p>
             <w:pPr>
               <w:pStyle w:val="Compact"/>
+              <w:jc w:val="left"/>
             </w:pPr>
             <w:r>
               <w:t xml:space="preserve">Free</w:t>
@@ -620,6 +627,7 @@
           <w:p>
             <w:pPr>
               <w:pStyle w:val="Compact"/>
+              <w:jc w:val="left"/>
             </w:pPr>
             <w:r>
               <w:t xml:space="preserve">Learning curve</w:t>
@@ -631,6 +639,7 @@
           <w:p>
             <w:pPr>
               <w:pStyle w:val="Compact"/>
+              <w:jc w:val="left"/>
             </w:pPr>
             <w:r>
               <w:t xml:space="preserve">Steep</w:t>
@@ -642,6 +651,7 @@
           <w:p>
             <w:pPr>
               <w:pStyle w:val="Compact"/>
+              <w:jc w:val="left"/>
             </w:pPr>
             <w:r>
               <w:t xml:space="preserve">Gentle</w:t>
@@ -655,6 +665,7 @@
           <w:p>
             <w:pPr>
               <w:pStyle w:val="Compact"/>
+              <w:jc w:val="left"/>
             </w:pPr>
             <w:r>
               <w:t xml:space="preserve">File size</w:t>
@@ -666,6 +677,7 @@
           <w:p>
             <w:pPr>
               <w:pStyle w:val="Compact"/>
+              <w:jc w:val="left"/>
             </w:pPr>
             <w:r>
               <w:t xml:space="preserve">Large</w:t>
@@ -677,6 +689,7 @@
           <w:p>
             <w:pPr>
               <w:pStyle w:val="Compact"/>
+              <w:jc w:val="left"/>
             </w:pPr>
             <w:r>
               <w:t xml:space="preserve">Small</w:t>
@@ -690,6 +703,7 @@
           <w:p>
             <w:pPr>
               <w:pStyle w:val="Compact"/>
+              <w:jc w:val="left"/>
             </w:pPr>
             <w:r>
               <w:t xml:space="preserve">Collaboration</w:t>
@@ -701,6 +715,7 @@
           <w:p>
             <w:pPr>
               <w:pStyle w:val="Compact"/>
+              <w:jc w:val="left"/>
             </w:pPr>
             <w:r>
               <w:t xml:space="preserve">Difficult</w:t>
@@ -712,6 +727,7 @@
           <w:p>
             <w:pPr>
               <w:pStyle w:val="Compact"/>
+              <w:jc w:val="left"/>
             </w:pPr>
             <w:r>
               <w:t xml:space="preserve">Easy</w:t>
@@ -720,8 +736,8 @@
         </w:tc>
       </w:tr>
     </w:tbl>
-    <w:bookmarkEnd w:id="14"/>
-    <w:bookmarkStart w:id="15" w:name="finding-3-quality-improvements"/>
+    <w:bookmarkEnd w:id="25"/>
+    <w:bookmarkStart w:id="26" w:name="finding-3-quality-improvements"/>
     <w:p>
       <w:pPr>
         <w:pStyle w:val="Heading3"/>
@@ -749,11 +765,11 @@
     </w:p>
     <w:p>
       <w:pPr>
-        <w:pStyle w:val="Compact"/>
         <w:numPr>
           <w:ilvl w:val="0"/>
           <w:numId w:val="1005"/>
         </w:numPr>
+        <w:pStyle w:val="Compact"/>
       </w:pPr>
       <w:r>
         <w:t xml:space="preserve">Consistency across documents</w:t>
@@ -761,11 +777,11 @@
     </w:p>
     <w:p>
       <w:pPr>
-        <w:pStyle w:val="Compact"/>
         <w:numPr>
           <w:ilvl w:val="0"/>
           <w:numId w:val="1005"/>
         </w:numPr>
+        <w:pStyle w:val="Compact"/>
       </w:pPr>
       <w:r>
         <w:t xml:space="preserve">Fewer formatting errors</w:t>
@@ -773,11 +789,11 @@
     </w:p>
     <w:p>
       <w:pPr>
-        <w:pStyle w:val="Compact"/>
         <w:numPr>
           <w:ilvl w:val="0"/>
           <w:numId w:val="1005"/>
         </w:numPr>
+        <w:pStyle w:val="Compact"/>
       </w:pPr>
       <w:r>
         <w:t xml:space="preserve">Professional appearance</w:t>
@@ -785,19 +801,19 @@
     </w:p>
     <w:p>
       <w:pPr>
-        <w:pStyle w:val="Compact"/>
         <w:numPr>
           <w:ilvl w:val="0"/>
           <w:numId w:val="1005"/>
         </w:numPr>
+        <w:pStyle w:val="Compact"/>
       </w:pPr>
       <w:r>
         <w:t xml:space="preserve">Better document structure</w:t>
       </w:r>
     </w:p>
-    <w:bookmarkEnd w:id="15"/>
-    <w:bookmarkEnd w:id="16"/>
-    <w:bookmarkStart w:id="18" w:name="recommendations"/>
+    <w:bookmarkEnd w:id="26"/>
+    <w:bookmarkEnd w:id="27"/>
+    <w:bookmarkStart w:id="29" w:name="recommendations"/>
     <w:p>
       <w:pPr>
         <w:pStyle w:val="Heading2"/>
@@ -825,93 +841,93 @@
     </w:p>
     <w:p>
       <w:pPr>
-        <w:pStyle w:val="Compact"/>
         <w:numPr>
           <w:ilvl w:val="0"/>
           <w:numId w:val="1006"/>
         </w:numPr>
-      </w:pPr>
-      <w:r>
-        <w:rPr>
+        <w:pStyle w:val="Compact"/>
+      </w:pPr>
+      <w:r>
+        <w:rPr>
+          <w:bCs/>
           <w:b/>
+        </w:rPr>
+        <w:t xml:space="preserve">Technical documentation</w:t>
+      </w:r>
+      <w:r>
+        <w:t xml:space="preserve"> </w:t>
+      </w:r>
+      <w:r>
+        <w:t xml:space="preserve">- API docs, guides, tutorials</w:t>
+      </w:r>
+    </w:p>
+    <w:p>
+      <w:pPr>
+        <w:numPr>
+          <w:ilvl w:val="0"/>
+          <w:numId w:val="1006"/>
+        </w:numPr>
+        <w:pStyle w:val="Compact"/>
+      </w:pPr>
+      <w:r>
+        <w:rPr>
           <w:bCs/>
-        </w:rPr>
-        <w:t xml:space="preserve">Technical documentation</w:t>
+          <w:b/>
+        </w:rPr>
+        <w:t xml:space="preserve">Reports</w:t>
       </w:r>
       <w:r>
         <w:t xml:space="preserve"> </w:t>
       </w:r>
       <w:r>
-        <w:t xml:space="preserve">- API docs, guides, tutorials</w:t>
-      </w:r>
-    </w:p>
-    <w:p>
-      <w:pPr>
-        <w:pStyle w:val="Compact"/>
+        <w:t xml:space="preserve">- Analysis, findings, recommendations</w:t>
+      </w:r>
+    </w:p>
+    <w:p>
+      <w:pPr>
         <w:numPr>
           <w:ilvl w:val="0"/>
           <w:numId w:val="1006"/>
         </w:numPr>
-      </w:pPr>
-      <w:r>
-        <w:rPr>
+        <w:pStyle w:val="Compact"/>
+      </w:pPr>
+      <w:r>
+        <w:rPr>
+          <w:bCs/>
           <w:b/>
+        </w:rPr>
+        <w:t xml:space="preserve">Proposals</w:t>
+      </w:r>
+      <w:r>
+        <w:t xml:space="preserve"> </w:t>
+      </w:r>
+      <w:r>
+        <w:t xml:space="preserve">- Business proposals, project plans</w:t>
+      </w:r>
+    </w:p>
+    <w:p>
+      <w:pPr>
+        <w:numPr>
+          <w:ilvl w:val="0"/>
+          <w:numId w:val="1006"/>
+        </w:numPr>
+        <w:pStyle w:val="Compact"/>
+      </w:pPr>
+      <w:r>
+        <w:rPr>
           <w:bCs/>
-        </w:rPr>
-        <w:t xml:space="preserve">Reports</w:t>
+          <w:b/>
+        </w:rPr>
+        <w:t xml:space="preserve">Newsletters</w:t>
       </w:r>
       <w:r>
         <w:t xml:space="preserve"> </w:t>
       </w:r>
       <w:r>
-        <w:t xml:space="preserve">- Analysis, findings, recommendations</w:t>
-      </w:r>
-    </w:p>
-    <w:p>
-      <w:pPr>
-        <w:pStyle w:val="Compact"/>
-        <w:numPr>
-          <w:ilvl w:val="0"/>
-          <w:numId w:val="1006"/>
-        </w:numPr>
-      </w:pPr>
-      <w:r>
-        <w:rPr>
-          <w:b/>
-          <w:bCs/>
-        </w:rPr>
-        <w:t xml:space="preserve">Proposals</w:t>
-      </w:r>
-      <w:r>
-        <w:t xml:space="preserve"> </w:t>
-      </w:r>
-      <w:r>
-        <w:t xml:space="preserve">- Business proposals, project plans</w:t>
-      </w:r>
-    </w:p>
-    <w:p>
-      <w:pPr>
-        <w:pStyle w:val="Compact"/>
-        <w:numPr>
-          <w:ilvl w:val="0"/>
-          <w:numId w:val="1006"/>
-        </w:numPr>
-      </w:pPr>
-      <w:r>
-        <w:rPr>
-          <w:b/>
-          <w:bCs/>
-        </w:rPr>
-        <w:t xml:space="preserve">Newsletters</w:t>
-      </w:r>
-      <w:r>
-        <w:t xml:space="preserve"> </w:t>
-      </w:r>
-      <w:r>
         <w:t xml:space="preserve">- Regular updates and communications</w:t>
       </w:r>
     </w:p>
-    <w:bookmarkStart w:id="17" w:name="implementation-steps"/>
+    <w:bookmarkStart w:id="28" w:name="implementation-steps"/>
     <w:p>
       <w:pPr>
         <w:pStyle w:val="Heading3"/>
@@ -939,11 +955,11 @@
     </w:p>
     <w:p>
       <w:pPr>
-        <w:pStyle w:val="Compact"/>
         <w:numPr>
           <w:ilvl w:val="0"/>
           <w:numId w:val="1007"/>
         </w:numPr>
+        <w:pStyle w:val="Compact"/>
       </w:pPr>
       <w:r>
         <w:t xml:space="preserve">Choose a high-impact document type</w:t>
@@ -951,11 +967,11 @@
     </w:p>
     <w:p>
       <w:pPr>
-        <w:pStyle w:val="Compact"/>
         <w:numPr>
           <w:ilvl w:val="0"/>
           <w:numId w:val="1007"/>
         </w:numPr>
+        <w:pStyle w:val="Compact"/>
       </w:pPr>
       <w:r>
         <w:t xml:space="preserve">Train the team on markdown syntax</w:t>
@@ -963,11 +979,11 @@
     </w:p>
     <w:p>
       <w:pPr>
-        <w:pStyle w:val="Compact"/>
         <w:numPr>
           <w:ilvl w:val="0"/>
           <w:numId w:val="1007"/>
         </w:numPr>
+        <w:pStyle w:val="Compact"/>
       </w:pPr>
       <w:r>
         <w:t xml:space="preserve">Set up the pandoc conversion pipeline</w:t>
@@ -975,11 +991,11 @@
     </w:p>
     <w:p>
       <w:pPr>
-        <w:pStyle w:val="Compact"/>
         <w:numPr>
           <w:ilvl w:val="0"/>
           <w:numId w:val="1007"/>
         </w:numPr>
+        <w:pStyle w:val="Compact"/>
       </w:pPr>
       <w:r>
         <w:t xml:space="preserve">Establish templates and standards</w:t>
@@ -987,19 +1003,19 @@
     </w:p>
     <w:p>
       <w:pPr>
-        <w:pStyle w:val="Compact"/>
         <w:numPr>
           <w:ilvl w:val="0"/>
           <w:numId w:val="1007"/>
         </w:numPr>
+        <w:pStyle w:val="Compact"/>
       </w:pPr>
       <w:r>
         <w:t xml:space="preserve">Integrate with your document management system</w:t>
       </w:r>
     </w:p>
-    <w:bookmarkEnd w:id="17"/>
-    <w:bookmarkEnd w:id="18"/>
-    <w:bookmarkStart w:id="20" w:name="conclusion"/>
+    <w:bookmarkEnd w:id="28"/>
+    <w:bookmarkEnd w:id="29"/>
+    <w:bookmarkStart w:id="31" w:name="conclusion"/>
     <w:p>
       <w:pPr>
         <w:pStyle w:val="Heading2"/>
@@ -1032,7 +1048,7 @@
         </w:pict>
       </w:r>
     </w:p>
-    <w:bookmarkStart w:id="19" w:name="appendix-code-example"/>
+    <w:bookmarkStart w:id="30" w:name="appendix-code-example"/>
     <w:p>
       <w:pPr>
         <w:pStyle w:val="Heading3"/>
@@ -1391,20 +1407,16 @@
       </w:pPr>
       <w:r>
         <w:rPr>
+          <w:iCs/>
           <w:i/>
-          <w:iCs/>
         </w:rPr>
         <w:t xml:space="preserve">Last updated: April 1, 2026</w:t>
       </w:r>
     </w:p>
-    <w:bookmarkEnd w:id="19"/>
-    <w:bookmarkEnd w:id="20"/>
-    <w:bookmarkEnd w:id="21"/>
-    <w:sectPr>
-      <w:footnotePr>
-        <w:numRestart w:val="eachSect"/>
-      </w:footnotePr>
-    </w:sectPr>
+    <w:bookmarkEnd w:id="30"/>
+    <w:bookmarkEnd w:id="31"/>
+    <w:bookmarkEnd w:id="32"/>
+    <w:sectPr/>
   </w:body>
 </w:document>
 </file>
@@ -1435,14 +1447,14 @@
 <file path=word/numbering.xml><?xml version="1.0" encoding="utf-8"?>
 <w:numbering xmlns:w="http://schemas.openxmlformats.org/wordprocessingml/2006/main">
   <w:abstractNum w:abstractNumId="990">
-    <w:nsid w:val="0000A990"/>
+    <w:nsid w:val="A990"/>
     <w:multiLevelType w:val="multilevel"/>
     <w:lvl w:ilvl="0">
       <w:numFmt w:val="bullet"/>
       <w:lvlText w:val=" "/>
       <w:lvlJc w:val="left"/>
       <w:pPr>
-        <w:ind w:left="720" w:hanging="360"/>
+        <w:ind w:left="720" w:hanging="480"/>
       </w:pPr>
     </w:lvl>
     <w:lvl w:ilvl="1">
@@ -1450,7 +1462,7 @@
       <w:lvlText w:val=" "/>
       <w:lvlJc w:val="left"/>
       <w:pPr>
-        <w:ind w:left="1440" w:hanging="360"/>
+        <w:ind w:left="1440" w:hanging="480"/>
       </w:pPr>
     </w:lvl>
     <w:lvl w:ilvl="2">
@@ -1458,7 +1470,7 @@
       <w:lvlText w:val=" "/>
       <w:lvlJc w:val="left"/>
       <w:pPr>
-        <w:ind w:left="2160" w:hanging="360"/>
+        <w:ind w:left="2160" w:hanging="480"/>
       </w:pPr>
     </w:lvl>
     <w:lvl w:ilvl="3">
@@ -1466,7 +1478,7 @@
       <w:lvlText w:val=" "/>
       <w:lvlJc w:val="left"/>
       <w:pPr>
-        <w:ind w:left="2880" w:hanging="360"/>
+        <w:ind w:left="2880" w:hanging="480"/>
       </w:pPr>
     </w:lvl>
     <w:lvl w:ilvl="4">
@@ -1474,7 +1486,7 @@
       <w:lvlText w:val=" "/>
       <w:lvlJc w:val="left"/>
       <w:pPr>
-        <w:ind w:left="3600" w:hanging="360"/>
+        <w:ind w:left="3600" w:hanging="480"/>
       </w:pPr>
     </w:lvl>
     <w:lvl w:ilvl="5">
@@ -1482,7 +1494,7 @@
       <w:lvlText w:val=" "/>
       <w:lvlJc w:val="left"/>
       <w:pPr>
-        <w:ind w:left="4320" w:hanging="360"/>
+        <w:ind w:left="4320" w:hanging="480"/>
       </w:pPr>
     </w:lvl>
     <w:lvl w:ilvl="6">
@@ -1490,7 +1502,7 @@
       <w:lvlText w:val=" "/>
       <w:lvlJc w:val="left"/>
       <w:pPr>
-        <w:ind w:left="5040" w:hanging="360"/>
+        <w:ind w:left="5040" w:hanging="480"/>
       </w:pPr>
     </w:lvl>
     <w:lvl w:ilvl="7">
@@ -1498,7 +1510,7 @@
       <w:lvlText w:val=" "/>
       <w:lvlJc w:val="left"/>
       <w:pPr>
-        <w:ind w:left="5760" w:hanging="360"/>
+        <w:ind w:left="5760" w:hanging="480"/>
       </w:pPr>
     </w:lvl>
     <w:lvl w:ilvl="8">
@@ -1506,12 +1518,12 @@
       <w:lvlText w:val=" "/>
       <w:lvlJc w:val="left"/>
       <w:pPr>
-        <w:ind w:left="6480" w:hanging="360"/>
+        <w:ind w:left="6480" w:hanging="480"/>
       </w:pPr>
     </w:lvl>
   </w:abstractNum>
   <w:abstractNum w:abstractNumId="99411">
-    <w:nsid w:val="00A99411"/>
+    <w:nsid w:val="A99411"/>
     <w:multiLevelType w:val="multilevel"/>
     <w:lvl w:ilvl="0">
       <w:start w:val="1"/>
@@ -1519,7 +1531,7 @@
       <w:lvlText w:val="%1."/>
       <w:lvlJc w:val="left"/>
       <w:pPr>
-        <w:ind w:left="720" w:hanging="360"/>
+        <w:ind w:left="720" w:hanging="480"/>
       </w:pPr>
     </w:lvl>
     <w:lvl w:ilvl="1">
@@ -1528,7 +1540,7 @@
       <w:lvlText w:val="%2."/>
       <w:lvlJc w:val="left"/>
       <w:pPr>
-        <w:ind w:left="1440" w:hanging="360"/>
+        <w:ind w:left="1440" w:hanging="480"/>
       </w:pPr>
     </w:lvl>
     <w:lvl w:ilvl="2">
@@ -1537,7 +1549,7 @@
       <w:lvlText w:val="%3."/>
       <w:lvlJc w:val="left"/>
       <w:pPr>
-        <w:ind w:left="2160" w:hanging="360"/>
+        <w:ind w:left="2160" w:hanging="480"/>
       </w:pPr>
     </w:lvl>
     <w:lvl w:ilvl="3">
@@ -1546,7 +1558,7 @@
       <w:lvlText w:val="%4."/>
       <w:lvlJc w:val="left"/>
       <w:pPr>
-        <w:ind w:left="2880" w:hanging="360"/>
+        <w:ind w:left="2880" w:hanging="480"/>
       </w:pPr>
     </w:lvl>
     <w:lvl w:ilvl="4">
@@ -1555,7 +1567,7 @@
       <w:lvlText w:val="%5."/>
       <w:lvlJc w:val="left"/>
       <w:pPr>
-        <w:ind w:left="3600" w:hanging="360"/>
+        <w:ind w:left="3600" w:hanging="480"/>
       </w:pPr>
     </w:lvl>
     <w:lvl w:ilvl="5">
@@ -1564,7 +1576,7 @@
       <w:lvlText w:val="%6."/>
       <w:lvlJc w:val="left"/>
       <w:pPr>
-        <w:ind w:left="4320" w:hanging="360"/>
+        <w:ind w:left="4320" w:hanging="480"/>
       </w:pPr>
     </w:lvl>
     <w:lvl w:ilvl="6">
@@ -1573,7 +1585,7 @@
       <w:lvlText w:val="%7."/>
       <w:lvlJc w:val="left"/>
       <w:pPr>
-        <w:ind w:left="5040" w:hanging="360"/>
+        <w:ind w:left="5040" w:hanging="480"/>
       </w:pPr>
     </w:lvl>
     <w:lvl w:ilvl="7">
@@ -1582,7 +1594,7 @@
       <w:lvlText w:val="%8."/>
       <w:lvlJc w:val="left"/>
       <w:pPr>
-        <w:ind w:left="5760" w:hanging="360"/>
+        <w:ind w:left="5760" w:hanging="480"/>
       </w:pPr>
     </w:lvl>
     <w:lvl w:ilvl="8">
@@ -1591,111 +1603,84 @@
       <w:lvlText w:val="%9."/>
       <w:lvlJc w:val="left"/>
       <w:pPr>
-        <w:ind w:left="6480" w:hanging="360"/>
+        <w:ind w:left="6480" w:hanging="480"/>
       </w:pPr>
     </w:lvl>
   </w:abstractNum>
   <w:abstractNum w:abstractNumId="991">
-    <w:nsid w:val="0000A991"/>
+    <w:nsid w:val="A991"/>
     <w:multiLevelType w:val="multilevel"/>
     <w:lvl w:ilvl="0">
       <w:numFmt w:val="bullet"/>
-      <w:lvlText w:val=""/>
+      <w:lvlText w:val="•"/>
       <w:lvlJc w:val="left"/>
       <w:pPr>
-        <w:ind w:left="720" w:hanging="360"/>
-      </w:pPr>
-      <w:rPr>
-        <w:rFonts w:ascii="Symbol" w:hAnsi="Symbol" w:cs="Symbol" w:hint="default"/>
-      </w:rPr>
+        <w:ind w:left="720" w:hanging="480"/>
+      </w:pPr>
     </w:lvl>
     <w:lvl w:ilvl="1">
       <w:numFmt w:val="bullet"/>
-      <w:lvlText w:val="o"/>
+      <w:lvlText w:val="–"/>
       <w:lvlJc w:val="left"/>
       <w:pPr>
-        <w:ind w:left="1440" w:hanging="360"/>
-      </w:pPr>
-      <w:rPr>
-        <w:rFonts w:ascii="Courier New" w:hAnsi="Courier New" w:cs="Courier New" w:hint="default"/>
-      </w:rPr>
+        <w:ind w:left="1440" w:hanging="480"/>
+      </w:pPr>
     </w:lvl>
     <w:lvl w:ilvl="2">
       <w:numFmt w:val="bullet"/>
-      <w:lvlText w:val=""/>
+      <w:lvlText w:val="•"/>
       <w:lvlJc w:val="left"/>
       <w:pPr>
-        <w:ind w:left="2160" w:hanging="360"/>
-      </w:pPr>
-      <w:rPr>
-        <w:rFonts w:ascii="Wingdings" w:hAnsi="Wingdings" w:cs="Wingdings" w:hint="default"/>
-      </w:rPr>
+        <w:ind w:left="2160" w:hanging="480"/>
+      </w:pPr>
     </w:lvl>
     <w:lvl w:ilvl="3">
       <w:numFmt w:val="bullet"/>
-      <w:lvlText w:val=""/>
+      <w:lvlText w:val="–"/>
       <w:lvlJc w:val="left"/>
       <w:pPr>
-        <w:ind w:left="2880" w:hanging="360"/>
-      </w:pPr>
-      <w:rPr>
-        <w:rFonts w:ascii="Symbol" w:hAnsi="Symbol" w:cs="Symbol" w:hint="default"/>
-      </w:rPr>
+        <w:ind w:left="2880" w:hanging="480"/>
+      </w:pPr>
     </w:lvl>
     <w:lvl w:ilvl="4">
       <w:numFmt w:val="bullet"/>
-      <w:lvlText w:val="o"/>
+      <w:lvlText w:val="•"/>
       <w:lvlJc w:val="left"/>
       <w:pPr>
-        <w:ind w:left="3600" w:hanging="360"/>
-      </w:pPr>
-      <w:rPr>
-        <w:rFonts w:ascii="Courier New" w:hAnsi="Courier New" w:cs="Courier New" w:hint="default"/>
-      </w:rPr>
+        <w:ind w:left="3600" w:hanging="480"/>
+      </w:pPr>
     </w:lvl>
     <w:lvl w:ilvl="5">
       <w:numFmt w:val="bullet"/>
-      <w:lvlText w:val=""/>
+      <w:lvlText w:val="–"/>
       <w:lvlJc w:val="left"/>
       <w:pPr>
-        <w:ind w:left="4320" w:hanging="360"/>
-      </w:pPr>
-      <w:rPr>
-        <w:rFonts w:ascii="Wingdings" w:hAnsi="Wingdings" w:cs="Wingdings" w:hint="default"/>
-      </w:rPr>
+        <w:ind w:left="4320" w:hanging="480"/>
+      </w:pPr>
     </w:lvl>
     <w:lvl w:ilvl="6">
       <w:numFmt w:val="bullet"/>
-      <w:lvlText w:val=""/>
+      <w:lvlText w:val="•"/>
       <w:lvlJc w:val="left"/>
       <w:pPr>
-        <w:ind w:left="5040" w:hanging="360"/>
-      </w:pPr>
-      <w:rPr>
-        <w:rFonts w:ascii="Symbol" w:hAnsi="Symbol" w:cs="Symbol" w:hint="default"/>
-      </w:rPr>
+        <w:ind w:left="5040" w:hanging="480"/>
+      </w:pPr>
     </w:lvl>
     <w:lvl w:ilvl="7">
       <w:numFmt w:val="bullet"/>
-      <w:lvlText w:val="o"/>
+      <w:lvlText w:val="–"/>
       <w:lvlJc w:val="left"/>
       <w:pPr>
-        <w:ind w:left="5760" w:hanging="360"/>
-      </w:pPr>
-      <w:rPr>
-        <w:rFonts w:ascii="Courier New" w:hAnsi="Courier New" w:cs="Courier New" w:hint="default"/>
-      </w:rPr>
+        <w:ind w:left="5760" w:hanging="480"/>
+      </w:pPr>
     </w:lvl>
     <w:lvl w:ilvl="8">
       <w:numFmt w:val="bullet"/>
-      <w:lvlText w:val=""/>
+      <w:lvlText w:val="•"/>
       <w:lvlJc w:val="left"/>
       <w:pPr>
-        <w:ind w:left="6480" w:hanging="360"/>
-      </w:pPr>
-      <w:rPr>
-        <w:rFonts w:ascii="Wingdings" w:hAnsi="Wingdings" w:cs="Wingdings" w:hint="default"/>
-      </w:rPr>
+        <w:ind w:left="6480" w:hanging="480"/>
+      </w:pPr>
     </w:lvl>
   </w:abstractNum>
   <w:num w:numId="1000">
@@ -1838,10 +1823,10 @@
   <w:docDefaults>
     <w:rPrDefault>
       <w:rPr>
-        <w:rFonts w:asciiTheme="minorHAnsi" w:cstheme="minorBidi" w:eastAsiaTheme="minorEastAsia" w:hAnsiTheme="minorHAnsi"/>
+        <w:rFonts w:asciiTheme="minorHAnsi" w:cstheme="minorBidi" w:eastAsiaTheme="minorHAnsi" w:hAnsiTheme="minorHAnsi"/>
         <w:sz w:val="24"/>
         <w:szCs w:val="24"/>
-        <w:lang w:bidi="ar-SA" w:eastAsia="zh-CN" w:val="en-US"/>
+        <w:lang w:bidi="ar-SA" w:eastAsia="en-US" w:val="en-US"/>
       </w:rPr>
     </w:rPrDefault>
     <w:pPrDefault>
@@ -1859,10 +1844,10 @@
     <w:name w:val="Body Text"/>
     <w:basedOn w:val="Normal"/>
     <w:link w:val="BodyTextChar"/>
-    <w:qFormat/>
     <w:pPr>
       <w:spacing w:after="180" w:before="180"/>
     </w:pPr>
+    <w:qFormat/>
   </w:style>
   <w:style w:customStyle="1" w:styleId="FirstParagraph" w:type="paragraph">
     <w:name w:val="First Paragraph"/>
@@ -1882,94 +1867,57 @@
     <w:name w:val="Title"/>
     <w:basedOn w:val="Normal"/>
     <w:next w:val="BodyText"/>
-    <w:link w:val="TitleChar"/>
-    <w:uiPriority w:val="10"/>
     <w:qFormat/>
-    <w:rsid w:val="00A10FD9"/>
     <w:pPr>
-      <w:spacing w:after="80" w:line="240" w:lineRule="auto"/>
-      <w:contextualSpacing/>
+      <w:keepNext/>
+      <w:keepLines/>
+      <w:spacing w:after="240" w:before="480"/>
       <w:jc w:val="center"/>
     </w:pPr>
     <w:rPr>
       <w:rFonts w:asciiTheme="majorHAnsi" w:cstheme="majorBidi" w:eastAsiaTheme="majorEastAsia" w:hAnsiTheme="majorHAnsi"/>
-      <w:sz w:val="56"/>
-      <w:szCs w:val="56"/>
-    </w:rPr>
-  </w:style>
-  <w:style w:customStyle="1" w:styleId="TitleChar" w:type="character">
-    <w:name w:val="Title Char"/>
-    <w:basedOn w:val="DefaultParagraphFont"/>
-    <w:link w:val="Title"/>
-    <w:uiPriority w:val="10"/>
-    <w:rsid w:val="00A10FD9"/>
-    <w:rPr>
-      <w:rFonts w:asciiTheme="majorHAnsi" w:cstheme="majorBidi" w:eastAsiaTheme="majorEastAsia" w:hAnsiTheme="majorHAnsi"/>
-      <w:sz w:val="56"/>
-      <w:szCs w:val="56"/>
+      <w:b/>
+      <w:bCs/>
+      <w:color w:themeColor="accent1" w:themeShade="B5" w:val="345A8A"/>
+      <w:sz w:val="36"/>
+      <w:szCs w:val="36"/>
     </w:rPr>
   </w:style>
   <w:style w:styleId="Subtitle" w:type="paragraph">
     <w:name w:val="Subtitle"/>
-    <w:basedOn w:val="Title"/>
-    <w:next w:val="BodyText"/>
-    <w:link w:val="SubtitleChar"/>
-    <w:uiPriority w:val="11"/>
-    <w:qFormat/>
-    <w:rsid w:val="00A10FD9"/>
-    <w:pPr>
-      <w:numPr>
-        <w:ilvl w:val="1"/>
-      </w:numPr>
-    </w:pPr>
-    <w:rPr>
-      <w:rFonts w:cstheme="majorBidi" w:eastAsiaTheme="majorEastAsia"/>
-      <w:spacing w:val="15"/>
-      <w:sz w:val="28"/>
-      <w:szCs w:val="28"/>
-    </w:rPr>
-  </w:style>
-  <w:style w:customStyle="1" w:styleId="SubtitleChar" w:type="character">
-    <w:name w:val="Subtitle Char"/>
-    <w:basedOn w:val="DefaultParagraphFont"/>
-    <w:link w:val="Subtitle"/>
-    <w:uiPriority w:val="11"/>
-    <w:rsid w:val="00A10FD9"/>
-    <w:rPr>
-      <w:rFonts w:cstheme="majorBidi" w:eastAsiaTheme="majorEastAsia"/>
-      <w:color w:themeColor="text1" w:themeTint="A6" w:val="595959"/>
-      <w:spacing w:val="15"/>
-      <w:sz w:val="28"/>
-      <w:szCs w:val="28"/>
-    </w:rPr>
-  </w:style>
-  <w:style w:customStyle="1" w:styleId="Author" w:type="paragraph">
-    <w:name w:val="Author"/>
     <w:basedOn w:val="Title"/>
     <w:next w:val="BodyText"/>
     <w:qFormat/>
     <w:pPr>
       <w:keepNext/>
       <w:keepLines/>
+      <w:spacing w:after="240" w:before="240"/>
+      <w:jc w:val="center"/>
     </w:pPr>
     <w:rPr>
-      <w:sz w:val="24"/>
-      <w:szCs w:val="24"/>
-    </w:rPr>
-  </w:style>
-  <w:style w:styleId="Date" w:type="paragraph">
-    <w:name w:val="Date"/>
-    <w:basedOn w:val="Title"/>
+      <w:sz w:val="30"/>
+      <w:szCs w:val="30"/>
+    </w:rPr>
+  </w:style>
+  <w:style w:customStyle="1" w:styleId="Author" w:type="paragraph">
+    <w:name w:val="Author"/>
     <w:next w:val="BodyText"/>
     <w:qFormat/>
     <w:pPr>
       <w:keepNext/>
       <w:keepLines/>
+      <w:jc w:val="center"/>
     </w:pPr>
-    <w:rPr>
-      <w:sz w:val="24"/>
-      <w:szCs w:val="24"/>
-    </w:rPr>
+  </w:style>
+  <w:style w:styleId="Date" w:type="paragraph">
+    <w:name w:val="Date"/>
+    <w:next w:val="BodyText"/>
+    <w:qFormat/>
+    <w:pPr>
+      <w:keepNext/>
+      <w:keepLines/>
+      <w:jc w:val="center"/>
+    </w:pPr>
   </w:style>
   <w:style w:customStyle="1" w:styleId="AbstractTitle" w:type="paragraph">
     <w:name w:val="Abstract Title"/>
@@ -1979,13 +1927,15 @@
     <w:pPr>
       <w:keepNext/>
       <w:keepLines/>
+      <w:jc w:val="center"/>
       <w:spacing w:after="0" w:before="300"/>
-      <w:jc w:val="center"/>
     </w:pPr>
     <w:rPr>
-      <w:b/>
       <w:sz w:val="20"/>
       <w:szCs w:val="20"/>
+      <w:b/>
+      <w:color w:val="345A8A"/>
+      &gt;
     </w:rPr>
   </w:style>
   <w:style w:customStyle="1" w:styleId="Abstract" w:type="paragraph">
@@ -2012,321 +1962,191 @@
     <w:rPr/>
   </w:style>
   <w:style w:styleId="Heading1" w:type="paragraph">
-    <w:name w:val="heading 1"/>
+    <w:name w:val="Heading 1"/>
     <w:basedOn w:val="Normal"/>
     <w:next w:val="BodyText"/>
-    <w:link w:val="Heading1Char"/>
     <w:uiPriority w:val="9"/>
     <w:qFormat/>
-    <w:rsid w:val="00A10FD9"/>
     <w:pPr>
       <w:keepNext/>
       <w:keepLines/>
-      <w:spacing w:after="80" w:before="360"/>
+      <w:spacing w:after="0" w:before="480"/>
       <w:outlineLvl w:val="0"/>
     </w:pPr>
     <w:rPr>
       <w:rFonts w:asciiTheme="majorHAnsi" w:cstheme="majorBidi" w:eastAsiaTheme="majorEastAsia" w:hAnsiTheme="majorHAnsi"/>
-      <w:color w:themeColor="accent1" w:themeShade="BF" w:val="0F4761"/>
-      <w:sz w:val="40"/>
-      <w:szCs w:val="40"/>
+      <w:b/>
+      <w:bCs/>
+      <w:color w:themeColor="accent1" w:val="4F81BD"/>
+      <w:sz w:val="32"/>
+      <w:szCs w:val="32"/>
     </w:rPr>
   </w:style>
   <w:style w:styleId="Heading2" w:type="paragraph">
-    <w:name w:val="heading 2"/>
+    <w:name w:val="Heading 2"/>
     <w:basedOn w:val="Normal"/>
     <w:next w:val="BodyText"/>
-    <w:link w:val="Heading2Char"/>
     <w:uiPriority w:val="9"/>
-    <w:semiHidden/>
     <w:unhideWhenUsed/>
     <w:qFormat/>
-    <w:rsid w:val="00A10FD9"/>
     <w:pPr>
       <w:keepNext/>
       <w:keepLines/>
-      <w:spacing w:after="80" w:before="160"/>
+      <w:spacing w:after="0" w:before="200"/>
       <w:outlineLvl w:val="1"/>
     </w:pPr>
     <w:rPr>
       <w:rFonts w:asciiTheme="majorHAnsi" w:cstheme="majorBidi" w:eastAsiaTheme="majorEastAsia" w:hAnsiTheme="majorHAnsi"/>
-      <w:color w:themeColor="accent1" w:themeShade="BF" w:val="0F4761"/>
-      <w:sz w:val="32"/>
-      <w:szCs w:val="32"/>
+      <w:b/>
+      <w:bCs/>
+      <w:color w:themeColor="accent1" w:val="4F81BD"/>
+      <w:sz w:val="28"/>
+      <w:szCs w:val="28"/>
     </w:rPr>
   </w:style>
   <w:style w:styleId="Heading3" w:type="paragraph">
-    <w:name w:val="heading 3"/>
+    <w:name w:val="Heading 3"/>
     <w:basedOn w:val="Normal"/>
     <w:next w:val="BodyText"/>
-    <w:link w:val="Heading3Char"/>
     <w:uiPriority w:val="9"/>
-    <w:semiHidden/>
     <w:unhideWhenUsed/>
     <w:qFormat/>
-    <w:rsid w:val="00A10FD9"/>
     <w:pPr>
       <w:keepNext/>
       <w:keepLines/>
-      <w:spacing w:after="80" w:before="160"/>
+      <w:spacing w:after="0" w:before="200"/>
       <w:outlineLvl w:val="2"/>
     </w:pPr>
     <w:rPr>
-      <w:rFonts w:cstheme="majorBidi" w:eastAsiaTheme="majorEastAsia"/>
-      <w:color w:themeColor="accent1" w:themeShade="BF" w:val="0F4761"/>
-      <w:sz w:val="28"/>
-      <w:szCs w:val="28"/>
+      <w:rFonts w:asciiTheme="majorHAnsi" w:cstheme="majorBidi" w:eastAsiaTheme="majorEastAsia" w:hAnsiTheme="majorHAnsi"/>
+      <w:b/>
+      <w:bCs/>
+      <w:color w:themeColor="accent1" w:val="4F81BD"/>
+      <w:sz w:val="24"/>
+      <w:szCs w:val="24"/>
     </w:rPr>
   </w:style>
   <w:style w:styleId="Heading4" w:type="paragraph">
-    <w:name w:val="heading 4"/>
+    <w:name w:val="Heading 4"/>
     <w:basedOn w:val="Normal"/>
     <w:next w:val="BodyText"/>
-    <w:link w:val="Heading4Char"/>
     <w:uiPriority w:val="9"/>
-    <w:semiHidden/>
     <w:unhideWhenUsed/>
     <w:qFormat/>
-    <w:rsid w:val="00A10FD9"/>
     <w:pPr>
       <w:keepNext/>
       <w:keepLines/>
-      <w:spacing w:after="40" w:before="80"/>
+      <w:spacing w:after="0" w:before="200"/>
       <w:outlineLvl w:val="3"/>
     </w:pPr>
     <w:rPr>
-      <w:rFonts w:cstheme="majorBidi" w:eastAsiaTheme="majorEastAsia"/>
+      <w:rFonts w:asciiTheme="majorHAnsi" w:cstheme="majorBidi" w:eastAsiaTheme="majorEastAsia" w:hAnsiTheme="majorHAnsi"/>
       <w:i/>
-      <w:iCs/>
-      <w:color w:themeColor="accent1" w:themeShade="BF" w:val="0F4761"/>
+      <w:bCs/>
+      <w:color w:themeColor="accent1" w:val="4F81BD"/>
+      <w:sz w:val="24"/>
+      <w:szCs w:val="24"/>
     </w:rPr>
   </w:style>
   <w:style w:styleId="Heading5" w:type="paragraph">
-    <w:name w:val="heading 5"/>
+    <w:name w:val="Heading 5"/>
     <w:basedOn w:val="Normal"/>
     <w:next w:val="BodyText"/>
-    <w:link w:val="Heading5Char"/>
     <w:uiPriority w:val="9"/>
-    <w:semiHidden/>
     <w:unhideWhenUsed/>
     <w:qFormat/>
-    <w:rsid w:val="00A10FD9"/>
     <w:pPr>
       <w:keepNext/>
       <w:keepLines/>
-      <w:spacing w:after="40" w:before="80"/>
+      <w:spacing w:after="0" w:before="200"/>
       <w:outlineLvl w:val="4"/>
     </w:pPr>
     <w:rPr>
-      <w:rFonts w:cstheme="majorBidi" w:eastAsiaTheme="majorEastAsia"/>
-      <w:color w:themeColor="accent1" w:themeShade="BF" w:val="0F4761"/>
+      <w:rFonts w:asciiTheme="majorHAnsi" w:cstheme="majorBidi" w:eastAsiaTheme="majorEastAsia" w:hAnsiTheme="majorHAnsi"/>
+      <w:iCs/>
+      <w:color w:themeColor="accent1" w:val="4F81BD"/>
+      <w:sz w:val="24"/>
+      <w:szCs w:val="24"/>
     </w:rPr>
   </w:style>
   <w:style w:styleId="Heading6" w:type="paragraph">
-    <w:name w:val="heading 6"/>
+    <w:name w:val="Heading 6"/>
     <w:basedOn w:val="Normal"/>
     <w:next w:val="BodyText"/>
-    <w:link w:val="Heading6Char"/>
     <w:uiPriority w:val="9"/>
-    <w:semiHidden/>
     <w:unhideWhenUsed/>
     <w:qFormat/>
-    <w:rsid w:val="00A10FD9"/>
     <w:pPr>
       <w:keepNext/>
       <w:keepLines/>
-      <w:spacing w:after="0" w:before="40"/>
+      <w:spacing w:after="0" w:before="200"/>
       <w:outlineLvl w:val="5"/>
     </w:pPr>
     <w:rPr>
-      <w:rFonts w:cstheme="majorBidi" w:eastAsiaTheme="majorEastAsia"/>
-      <w:i/>
-      <w:iCs/>
-      <w:color w:themeColor="text1" w:themeTint="A6" w:val="595959"/>
+      <w:rFonts w:asciiTheme="majorHAnsi" w:cstheme="majorBidi" w:eastAsiaTheme="majorEastAsia" w:hAnsiTheme="majorHAnsi"/>
+      <w:color w:themeColor="accent1" w:val="4F81BD"/>
+      <w:sz w:val="24"/>
+      <w:szCs w:val="24"/>
     </w:rPr>
   </w:style>
   <w:style w:styleId="Heading7" w:type="paragraph">
-    <w:name w:val="heading 7"/>
+    <w:name w:val="Heading 7"/>
     <w:basedOn w:val="Normal"/>
     <w:next w:val="BodyText"/>
-    <w:link w:val="Heading7Char"/>
     <w:uiPriority w:val="9"/>
-    <w:semiHidden/>
     <w:unhideWhenUsed/>
     <w:qFormat/>
-    <w:rsid w:val="00A10FD9"/>
     <w:pPr>
       <w:keepNext/>
       <w:keepLines/>
-      <w:spacing w:after="0" w:before="40"/>
+      <w:spacing w:after="0" w:before="200"/>
       <w:outlineLvl w:val="6"/>
     </w:pPr>
     <w:rPr>
-      <w:rFonts w:cstheme="majorBidi" w:eastAsiaTheme="majorEastAsia"/>
-      <w:color w:themeColor="text1" w:themeTint="A6" w:val="595959"/>
+      <w:rFonts w:asciiTheme="majorHAnsi" w:cstheme="majorBidi" w:eastAsiaTheme="majorEastAsia" w:hAnsiTheme="majorHAnsi"/>
+      <w:color w:themeColor="accent1" w:val="4F81BD"/>
+      <w:sz w:val="24"/>
+      <w:szCs w:val="24"/>
     </w:rPr>
   </w:style>
   <w:style w:styleId="Heading8" w:type="paragraph">
-    <w:name w:val="heading 8"/>
+    <w:name w:val="Heading 8"/>
     <w:basedOn w:val="Normal"/>
     <w:next w:val="BodyText"/>
-    <w:link w:val="Heading8Char"/>
     <w:uiPriority w:val="9"/>
-    <w:semiHidden/>
     <w:unhideWhenUsed/>
     <w:qFormat/>
-    <w:rsid w:val="00A10FD9"/>
     <w:pPr>
       <w:keepNext/>
       <w:keepLines/>
-      <w:spacing w:after="0"/>
+      <w:spacing w:after="0" w:before="200"/>
       <w:outlineLvl w:val="7"/>
     </w:pPr>
     <w:rPr>
-      <w:rFonts w:cstheme="majorBidi" w:eastAsiaTheme="majorEastAsia"/>
-      <w:i/>
-      <w:iCs/>
-      <w:color w:themeColor="text1" w:themeTint="D8" w:val="272727"/>
+      <w:rFonts w:asciiTheme="majorHAnsi" w:cstheme="majorBidi" w:eastAsiaTheme="majorEastAsia" w:hAnsiTheme="majorHAnsi"/>
+      <w:color w:themeColor="accent1" w:val="4F81BD"/>
+      <w:sz w:val="24"/>
+      <w:szCs w:val="24"/>
     </w:rPr>
   </w:style>
   <w:style w:styleId="Heading9" w:type="paragraph">
-    <w:name w:val="heading 9"/>
+    <w:name w:val="Heading 9"/>
     <w:basedOn w:val="Normal"/>
     <w:next w:val="BodyText"/>
-    <w:link w:val="Heading9Char"/>
     <w:uiPriority w:val="9"/>
-    <w:semiHidden/>
     <w:unhideWhenUsed/>
     <w:qFormat/>
-    <w:rsid w:val="00A10FD9"/>
     <w:pPr>
       <w:keepNext/>
       <w:keepLines/>
-      <w:spacing w:after="0"/>
+      <w:spacing w:after="0" w:before="200"/>
       <w:outlineLvl w:val="8"/>
     </w:pPr>
     <w:rPr>
-      <w:rFonts w:cstheme="majorBidi" w:eastAsiaTheme="majorEastAsia"/>
-      <w:color w:themeColor="text1" w:themeTint="D8" w:val="272727"/>
-    </w:rPr>
-  </w:style>
-  <w:style w:customStyle="1" w:styleId="Heading1Char" w:type="character">
-    <w:name w:val="Heading 1 Char"/>
-    <w:basedOn w:val="DefaultParagraphFont"/>
-    <w:link w:val="Heading1"/>
-    <w:uiPriority w:val="9"/>
-    <w:rsid w:val="00A10FD9"/>
-    <w:rPr>
       <w:rFonts w:asciiTheme="majorHAnsi" w:cstheme="majorBidi" w:eastAsiaTheme="majorEastAsia" w:hAnsiTheme="majorHAnsi"/>
-      <w:color w:themeColor="accent1" w:themeShade="BF" w:val="0F4761"/>
-      <w:sz w:val="40"/>
-      <w:szCs w:val="40"/>
-    </w:rPr>
-  </w:style>
-  <w:style w:customStyle="1" w:styleId="Heading2Char" w:type="character">
-    <w:name w:val="Heading 2 Char"/>
-    <w:basedOn w:val="DefaultParagraphFont"/>
-    <w:link w:val="Heading2"/>
-    <w:uiPriority w:val="9"/>
-    <w:semiHidden/>
-    <w:rsid w:val="00A10FD9"/>
-    <w:rPr>
-      <w:rFonts w:asciiTheme="majorHAnsi" w:cstheme="majorBidi" w:eastAsiaTheme="majorEastAsia" w:hAnsiTheme="majorHAnsi"/>
-      <w:color w:themeColor="accent1" w:themeShade="BF" w:val="0F4761"/>
-      <w:sz w:val="32"/>
-      <w:szCs w:val="32"/>
-    </w:rPr>
-  </w:style>
-  <w:style w:customStyle="1" w:styleId="Heading3Char" w:type="character">
-    <w:name w:val="Heading 3 Char"/>
-    <w:basedOn w:val="DefaultParagraphFont"/>
-    <w:link w:val="Heading3"/>
-    <w:uiPriority w:val="9"/>
-    <w:semiHidden/>
-    <w:rsid w:val="00A10FD9"/>
-    <w:rPr>
-      <w:rFonts w:cstheme="majorBidi" w:eastAsiaTheme="majorEastAsia"/>
-      <w:color w:themeColor="accent1" w:themeShade="BF" w:val="0F4761"/>
-      <w:sz w:val="28"/>
-      <w:szCs w:val="28"/>
-    </w:rPr>
-  </w:style>
-  <w:style w:customStyle="1" w:styleId="Heading4Char" w:type="character">
-    <w:name w:val="Heading 4 Char"/>
-    <w:basedOn w:val="DefaultParagraphFont"/>
-    <w:link w:val="Heading4"/>
-    <w:uiPriority w:val="9"/>
-    <w:semiHidden/>
-    <w:rsid w:val="00A10FD9"/>
-    <w:rPr>
-      <w:rFonts w:cstheme="majorBidi" w:eastAsiaTheme="majorEastAsia"/>
-      <w:i/>
-      <w:iCs/>
-      <w:color w:themeColor="accent1" w:themeShade="BF" w:val="0F4761"/>
-    </w:rPr>
-  </w:style>
-  <w:style w:customStyle="1" w:styleId="Heading5Char" w:type="character">
-    <w:name w:val="Heading 5 Char"/>
-    <w:basedOn w:val="DefaultParagraphFont"/>
-    <w:link w:val="Heading5"/>
-    <w:uiPriority w:val="9"/>
-    <w:semiHidden/>
-    <w:rsid w:val="00A10FD9"/>
-    <w:rPr>
-      <w:rFonts w:cstheme="majorBidi" w:eastAsiaTheme="majorEastAsia"/>
-      <w:color w:themeColor="accent1" w:themeShade="BF" w:val="0F4761"/>
-    </w:rPr>
-  </w:style>
-  <w:style w:customStyle="1" w:styleId="Heading6Char" w:type="character">
-    <w:name w:val="Heading 6 Char"/>
-    <w:basedOn w:val="DefaultParagraphFont"/>
-    <w:link w:val="Heading6"/>
-    <w:uiPriority w:val="9"/>
-    <w:semiHidden/>
-    <w:rsid w:val="00A10FD9"/>
-    <w:rPr>
-      <w:rFonts w:cstheme="majorBidi" w:eastAsiaTheme="majorEastAsia"/>
-      <w:i/>
-      <w:iCs/>
-      <w:color w:themeColor="text1" w:themeTint="A6" w:val="595959"/>
-    </w:rPr>
-  </w:style>
-  <w:style w:customStyle="1" w:styleId="Heading7Char" w:type="character">
-    <w:name w:val="Heading 7 Char"/>
-    <w:basedOn w:val="DefaultParagraphFont"/>
-    <w:link w:val="Heading7"/>
-    <w:uiPriority w:val="9"/>
-    <w:semiHidden/>
-    <w:rsid w:val="00A10FD9"/>
-    <w:rPr>
-      <w:rFonts w:cstheme="majorBidi" w:eastAsiaTheme="majorEastAsia"/>
-      <w:color w:themeColor="text1" w:themeTint="A6" w:val="595959"/>
-    </w:rPr>
-  </w:style>
-  <w:style w:customStyle="1" w:styleId="Heading8Char" w:type="character">
-    <w:name w:val="Heading 8 Char"/>
-    <w:basedOn w:val="DefaultParagraphFont"/>
-    <w:link w:val="Heading8"/>
-    <w:uiPriority w:val="9"/>
-    <w:semiHidden/>
-    <w:rsid w:val="00A10FD9"/>
-    <w:rPr>
-      <w:rFonts w:cstheme="majorBidi" w:eastAsiaTheme="majorEastAsia"/>
-      <w:i/>
-      <w:iCs/>
-      <w:color w:themeColor="text1" w:themeTint="D8" w:val="272727"/>
-    </w:rPr>
-  </w:style>
-  <w:style w:customStyle="1" w:styleId="Heading9Char" w:type="character">
-    <w:name w:val="Heading 9 Char"/>
-    <w:basedOn w:val="DefaultParagraphFont"/>
-    <w:link w:val="Heading9"/>
-    <w:uiPriority w:val="9"/>
-    <w:semiHidden/>
-    <w:rsid w:val="00A10FD9"/>
-    <w:rPr>
-      <w:rFonts w:cstheme="majorBidi" w:eastAsiaTheme="majorEastAsia"/>
-      <w:color w:themeColor="text1" w:themeTint="D8" w:val="272727"/>
+      <w:color w:themeColor="accent1" w:val="4F81BD"/>
+      <w:sz w:val="24"/>
+      <w:szCs w:val="24"/>
     </w:rPr>
   </w:style>
   <w:style w:styleId="BlockText" w:type="paragraph">
@@ -2348,18 +2168,6 @@
     <w:uiPriority w:val="9"/>
     <w:unhideWhenUsed/>
     <w:qFormat/>
-  </w:style>
-  <w:style w:styleId="FootnoteBlockText" w:type="paragraph">
-    <w:name w:val="Footnote Block Text"/>
-    <w:basedOn w:val="FootnoteText"/>
-    <w:next w:val="FootnoteText"/>
-    <w:uiPriority w:val="9"/>
-    <w:unhideWhenUsed/>
-    <w:qFormat/>
-    <w:pPr>
-      <w:spacing w:after="100" w:before="100"/>
-      <w:ind w:firstLine="0" w:left="480" w:right="480"/>
-    </w:pPr>
   </w:style>
   <w:style w:default="1" w:styleId="DefaultParagraphFont" w:type="character">
     <w:name w:val="Default Paragraph Font"/>
@@ -2382,11 +2190,18 @@
       </w:tblCellMar>
     </w:tblPr>
     <w:tblStylePr w:type="firstRow">
+      <w:tblPr>
+        <w:jc w:val="left"/>
+        <w:tblInd w:type="dxa" w:w="0"/>
+      </w:tblPr>
+      <w:trPr>
+        <w:jc w:val="left"/>
+      </w:trPr>
       <w:tcPr>
+        <w:vAlign w:val="bottom"/>
         <w:tcBorders>
           <w:bottom w:val="single"/>
         </w:tcBorders>
-        <w:vAlign w:val="bottom"/>
       </w:tcPr>
     </w:tblStylePr>
   </w:style>
@@ -2501,8 +2316,8 @@
     <w:name w:val="KeywordTok"/>
     <w:basedOn w:val="VerbatimChar"/>
     <w:rPr>
+      <w:color w:val="007020"/>
       <w:b/>
-      <w:color w:val="007020"/>
     </w:rPr>
   </w:style>
   <w:style w:type="character" w:customStyle="1" w:styleId="DataTypeTok">
@@ -2579,42 +2394,42 @@
     <w:name w:val="ImportTok"/>
     <w:basedOn w:val="VerbatimChar"/>
     <w:rPr>
+      <w:color w:val="008000"/>
       <w:b/>
-      <w:color w:val="008000"/>
     </w:rPr>
   </w:style>
   <w:style w:type="character" w:customStyle="1" w:styleId="CommentTok">
     <w:name w:val="CommentTok"/>
     <w:basedOn w:val="VerbatimChar"/>
     <w:rPr>
+      <w:color w:val="60a0b0"/>
       <w:i/>
-      <w:color w:val="60a0b0"/>
     </w:rPr>
   </w:style>
   <w:style w:type="character" w:customStyle="1" w:styleId="DocumentationTok">
     <w:name w:val="DocumentationTok"/>
     <w:basedOn w:val="VerbatimChar"/>
     <w:rPr>
+      <w:color w:val="ba2121"/>
       <w:i/>
-      <w:color w:val="ba2121"/>
     </w:rPr>
   </w:style>
   <w:style w:type="character" w:customStyle="1" w:styleId="AnnotationTok">
     <w:name w:val="AnnotationTok"/>
     <w:basedOn w:val="VerbatimChar"/>
     <w:rPr>
+      <w:color w:val="60a0b0"/>
       <w:b/>
       <w:i/>
-      <w:color w:val="60a0b0"/>
     </w:rPr>
   </w:style>
   <w:style w:type="character" w:customStyle="1" w:styleId="CommentVarTok">
     <w:name w:val="CommentVarTok"/>
     <w:basedOn w:val="VerbatimChar"/>
     <w:rPr>
+      <w:color w:val="60a0b0"/>
       <w:b/>
       <w:i/>
-      <w:color w:val="60a0b0"/>
     </w:rPr>
   </w:style>
   <w:style w:type="character" w:customStyle="1" w:styleId="OtherTok">
@@ -2642,8 +2457,8 @@
     <w:name w:val="ControlFlowTok"/>
     <w:basedOn w:val="VerbatimChar"/>
     <w:rPr>
+      <w:color w:val="007020"/>
       <w:b/>
-      <w:color w:val="007020"/>
     </w:rPr>
   </w:style>
   <w:style w:type="character" w:customStyle="1" w:styleId="OperatorTok">
@@ -2688,34 +2503,34 @@
     <w:name w:val="InformationTok"/>
     <w:basedOn w:val="VerbatimChar"/>
     <w:rPr>
+      <w:color w:val="60a0b0"/>
       <w:b/>
       <w:i/>
-      <w:color w:val="60a0b0"/>
     </w:rPr>
   </w:style>
   <w:style w:type="character" w:customStyle="1" w:styleId="WarningTok">
     <w:name w:val="WarningTok"/>
     <w:basedOn w:val="VerbatimChar"/>
     <w:rPr>
+      <w:color w:val="60a0b0"/>
       <w:b/>
       <w:i/>
-      <w:color w:val="60a0b0"/>
     </w:rPr>
   </w:style>
   <w:style w:type="character" w:customStyle="1" w:styleId="AlertTok">
     <w:name w:val="AlertTok"/>
     <w:basedOn w:val="VerbatimChar"/>
     <w:rPr>
+      <w:color w:val="ff0000"/>
       <w:b/>
-      <w:color w:val="ff0000"/>
     </w:rPr>
   </w:style>
   <w:style w:type="character" w:customStyle="1" w:styleId="ErrorTok">
     <w:name w:val="ErrorTok"/>
     <w:basedOn w:val="VerbatimChar"/>
     <w:rPr>
+      <w:color w:val="ff0000"/>
       <w:b/>
-      <w:color w:val="ff0000"/>
     </w:rPr>
   </w:style>
   <w:style w:type="character" w:customStyle="1" w:styleId="NormalTok">
@@ -2737,44 +2552,44 @@
         <a:sysClr val="window" lastClr="FFFFFF"/>
       </a:lt1>
       <a:dk2>
-        <a:srgbClr val="0E2841"/>
+        <a:srgbClr val="1F497D"/>
       </a:dk2>
       <a:lt2>
-        <a:srgbClr val="E8E8E8"/>
+        <a:srgbClr val="EEECE1"/>
       </a:lt2>
       <a:accent1>
-        <a:srgbClr val="156082"/>
+        <a:srgbClr val="4F81BD"/>
       </a:accent1>
       <a:accent2>
-        <a:srgbClr val="E97132"/>
+        <a:srgbClr val="C0504D"/>
       </a:accent2>
       <a:accent3>
-        <a:srgbClr val="196B24"/>
+        <a:srgbClr val="9BBB59"/>
       </a:accent3>
       <a:accent4>
-        <a:srgbClr val="0F9ED5"/>
+        <a:srgbClr val="8064A2"/>
       </a:accent4>
       <a:accent5>
-        <a:srgbClr val="A02B93"/>
+        <a:srgbClr val="4BACC6"/>
       </a:accent5>
       <a:accent6>
-        <a:srgbClr val="4EA72E"/>
+        <a:srgbClr val="F79646"/>
       </a:accent6>
       <a:hlink>
-        <a:srgbClr val="467886"/>
+        <a:srgbClr val="0000FF"/>
       </a:hlink>
       <a:folHlink>
-        <a:srgbClr val="96607D"/>
+        <a:srgbClr val="800080"/>
       </a:folHlink>
     </a:clrScheme>
     <a:fontScheme name="Office">
       <a:majorFont>
-        <a:latin typeface="Aptos Display" panose="02110004020202020204"/>
+        <a:latin typeface="Calibri"/>
         <a:ea typeface=""/>
         <a:cs typeface=""/>
-        <a:font script="Jpan" typeface="游ゴシック Light"/>
+        <a:font script="Jpan" typeface="ＭＳ ゴシック"/>
         <a:font script="Hang" typeface="맑은 고딕"/>
-        <a:font script="Hans" typeface="等线 Light"/>
+        <a:font script="Hans" typeface="宋体"/>
         <a:font script="Hant" typeface="新細明體"/>
         <a:font script="Arab" typeface="Times New Roman"/>
         <a:font script="Hebr" typeface="Times New Roman"/>
@@ -2801,32 +2616,14 @@
         <a:font script="Mong" typeface="Mongolian Baiti"/>
         <a:font script="Viet" typeface="Times New Roman"/>
         <a:font script="Uigh" typeface="Microsoft Uighur"/>
-        <a:font script="Geor" typeface="Sylfaen"/>
-        <a:font script="Armn" typeface="Arial"/>
-        <a:font script="Bugi" typeface="Leelawadee UI"/>
-        <a:font script="Bopo" typeface="Microsoft JhengHei"/>
-        <a:font script="Java" typeface="Javanese Text"/>
-        <a:font script="Lisu" typeface="Segoe UI"/>
-        <a:font script="Mymr" typeface="Myanmar Text"/>
-        <a:font script="Nkoo" typeface="Ebrima"/>
-        <a:font script="Olck" typeface="Nirmala UI"/>
-        <a:font script="Osma" typeface="Ebrima"/>
-        <a:font script="Phag" typeface="Phagspa"/>
-        <a:font script="Syrn" typeface="Estrangelo Edessa"/>
-        <a:font script="Syrj" typeface="Estrangelo Edessa"/>
-        <a:font script="Syre" typeface="Estrangelo Edessa"/>
-        <a:font script="Sora" typeface="Nirmala UI"/>
-        <a:font script="Tale" typeface="Microsoft Tai Le"/>
-        <a:font script="Talu" typeface="Microsoft New Tai Lue"/>
-        <a:font script="Tfng" typeface="Ebrima"/>
       </a:majorFont>
       <a:minorFont>
-        <a:latin typeface="Aptos" panose="02110004020202020204"/>
+        <a:latin typeface="Cambria"/>
         <a:ea typeface=""/>
         <a:cs typeface=""/>
-        <a:font script="Jpan" typeface="游明朝"/>
+        <a:font script="Jpan" typeface="ＭＳ 明朝"/>
         <a:font script="Hang" typeface="맑은 고딕"/>
-        <a:font script="Hans" typeface="等线"/>
+        <a:font script="Hans" typeface="宋体"/>
         <a:font script="Hant" typeface="新細明體"/>
         <a:font script="Arab" typeface="Arial"/>
         <a:font script="Hebr" typeface="Arial"/>
@@ -2853,24 +2650,6 @@
         <a:font script="Mong" typeface="Mongolian Baiti"/>
         <a:font script="Viet" typeface="Arial"/>
         <a:font script="Uigh" typeface="Microsoft Uighur"/>
-        <a:font script="Geor" typeface="Sylfaen"/>
-        <a:font script="Armn" typeface="Arial"/>
-        <a:font script="Bugi" typeface="Leelawadee UI"/>
-        <a:font script="Bopo" typeface="Microsoft JhengHei"/>
-        <a:font script="Java" typeface="Javanese Text"/>
-        <a:font script="Lisu" typeface="Segoe UI"/>
-        <a:font script="Mymr" typeface="Myanmar Text"/>
-        <a:font script="Nkoo" typeface="Ebrima"/>
-        <a:font script="Olck" typeface="Nirmala UI"/>
-        <a:font script="Osma" typeface="Ebrima"/>
-        <a:font script="Phag" typeface="Phagspa"/>
-        <a:font script="Syrn" typeface="Estrangelo Edessa"/>
-        <a:font script="Syrj" typeface="Estrangelo Edessa"/>
-        <a:font script="Syre" typeface="Estrangelo Edessa"/>
-        <a:font script="Sora" typeface="Nirmala UI"/>
-        <a:font script="Tale" typeface="Microsoft Tai Le"/>
-        <a:font script="Talu" typeface="Microsoft New Tai Lue"/>
-        <a:font script="Tfng" typeface="Ebrima"/>
       </a:minorFont>
     </a:fontScheme>
     <a:fmtScheme name="Office">
@@ -2882,141 +2661,200 @@
           <a:gsLst>
             <a:gs pos="0">
               <a:schemeClr val="phClr">
-                <a:lumMod val="110000"/>
-                <a:satMod val="105000"/>
-                <a:tint val="67000"/>
+                <a:tint val="50000"/>
+                <a:satMod val="300000"/>
               </a:schemeClr>
             </a:gs>
-            <a:gs pos="50000">
+            <a:gs pos="35000">
               <a:schemeClr val="phClr">
-                <a:lumMod val="105000"/>
-                <a:satMod val="103000"/>
-                <a:tint val="73000"/>
+                <a:tint val="37000"/>
+                <a:satMod val="300000"/>
               </a:schemeClr>
             </a:gs>
             <a:gs pos="100000">
               <a:schemeClr val="phClr">
-                <a:lumMod val="105000"/>
-                <a:satMod val="109000"/>
-                <a:tint val="81000"/>
+                <a:tint val="15000"/>
+                <a:satMod val="350000"/>
               </a:schemeClr>
             </a:gs>
           </a:gsLst>
-          <a:lin ang="5400000" scaled="0"/>
+          <a:lin ang="16200000" scaled="1"/>
         </a:gradFill>
         <a:gradFill rotWithShape="1">
           <a:gsLst>
             <a:gs pos="0">
               <a:schemeClr val="phClr">
-                <a:satMod val="103000"/>
-                <a:lumMod val="102000"/>
-                <a:tint val="94000"/>
-              </a:schemeClr>
-            </a:gs>
-            <a:gs pos="50000">
-              <a:schemeClr val="phClr">
-                <a:satMod val="110000"/>
-                <a:lumMod val="100000"/>
+                <a:tint val="100000"/>
                 <a:shade val="100000"/>
+                <a:satMod val="130000"/>
               </a:schemeClr>
             </a:gs>
             <a:gs pos="100000">
               <a:schemeClr val="phClr">
-                <a:lumMod val="99000"/>
-                <a:satMod val="120000"/>
-                <a:shade val="78000"/>
+                <a:tint val="50000"/>
+                <a:shade val="100000"/>
+                <a:satMod val="350000"/>
               </a:schemeClr>
             </a:gs>
           </a:gsLst>
-          <a:lin ang="5400000" scaled="0"/>
+          <a:lin ang="16200000" scaled="0"/>
         </a:gradFill>
       </a:fillStyleLst>
       <a:lnStyleLst>
-        <a:ln w="6350" cap="flat" cmpd="sng" algn="ctr">
+        <a:ln w="9525" cap="flat" cmpd="sng" algn="ctr">
+          <a:solidFill>
+            <a:schemeClr val="phClr">
+              <a:shade val="95000"/>
+              <a:satMod val="105000"/>
+            </a:schemeClr>
+          </a:solidFill>
+          <a:prstDash val="solid"/>
+        </a:ln>
+        <a:ln w="25400" cap="flat" cmpd="sng" algn="ctr">
           <a:solidFill>
             <a:schemeClr val="phClr"/>
           </a:solidFill>
           <a:prstDash val="solid"/>
-          <a:miter lim="800000"/>
         </a:ln>
-        <a:ln w="12700" cap="flat" cmpd="sng" algn="ctr">
+        <a:ln w="38100" cap="flat" cmpd="sng" algn="ctr">
           <a:solidFill>
             <a:schemeClr val="phClr"/>
           </a:solidFill>
           <a:prstDash val="solid"/>
-          <a:miter lim="800000"/>
-        </a:ln>
-        <a:ln w="19050" cap="flat" cmpd="sng" algn="ctr">
-          <a:solidFill>
-            <a:schemeClr val="phClr"/>
-          </a:solidFill>
-          <a:prstDash val="solid"/>
-          <a:miter lim="800000"/>
         </a:ln>
       </a:lnStyleLst>
       <a:effectStyleLst>
         <a:effectStyle>
-          <a:effectLst/>
-        </a:effectStyle>
-        <a:effectStyle>
-          <a:effectLst/>
+          <a:effectLst>
+            <a:outerShdw blurRad="40000" dist="20000" dir="5400000" rotWithShape="0">
+              <a:srgbClr val="000000">
+                <a:alpha val="38000"/>
+              </a:srgbClr>
+            </a:outerShdw>
+          </a:effectLst>
         </a:effectStyle>
         <a:effectStyle>
           <a:effectLst>
-            <a:outerShdw blurRad="57150" dist="19050" dir="5400000" algn="ctr" rotWithShape="0">
+            <a:outerShdw blurRad="40000" dist="23000" dir="5400000" rotWithShape="0">
               <a:srgbClr val="000000">
-                <a:alpha val="63000"/>
+                <a:alpha val="35000"/>
               </a:srgbClr>
             </a:outerShdw>
           </a:effectLst>
+        </a:effectStyle>
+        <a:effectStyle>
+          <a:effectLst>
+            <a:outerShdw blurRad="40000" dist="23000" dir="5400000" rotWithShape="0">
+              <a:srgbClr val="000000">
+                <a:alpha val="35000"/>
+              </a:srgbClr>
+            </a:outerShdw>
+          </a:effectLst>
+          <a:scene3d>
+            <a:camera prst="orthographicFront">
+              <a:rot lat="0" lon="0" rev="0"/>
+            </a:camera>
+            <a:lightRig rig="threePt" dir="t">
+              <a:rot lat="0" lon="0" rev="1200000"/>
+            </a:lightRig>
+          </a:scene3d>
+          <a:sp3d>
+            <a:bevelT w="63500" h="25400"/>
+          </a:sp3d>
         </a:effectStyle>
       </a:effectStyleLst>
       <a:bgFillStyleLst>
         <a:solidFill>
           <a:schemeClr val="phClr"/>
         </a:solidFill>
-        <a:solidFill>
-          <a:schemeClr val="phClr">
-            <a:tint val="95000"/>
-            <a:satMod val="170000"/>
-          </a:schemeClr>
-        </a:solidFill>
         <a:gradFill rotWithShape="1">
           <a:gsLst>
             <a:gs pos="0">
               <a:schemeClr val="phClr">
-                <a:tint val="93000"/>
-                <a:satMod val="150000"/>
-                <a:shade val="98000"/>
-                <a:lumMod val="102000"/>
+                <a:tint val="40000"/>
+                <a:satMod val="350000"/>
               </a:schemeClr>
             </a:gs>
-            <a:gs pos="50000">
+            <a:gs pos="40000">
               <a:schemeClr val="phClr">
-                <a:tint val="98000"/>
-                <a:satMod val="130000"/>
-                <a:shade val="90000"/>
-                <a:lumMod val="103000"/>
+                <a:tint val="45000"/>
+                <a:shade val="99000"/>
+                <a:satMod val="350000"/>
               </a:schemeClr>
             </a:gs>
             <a:gs pos="100000">
               <a:schemeClr val="phClr">
-                <a:shade val="63000"/>
-                <a:satMod val="120000"/>
+                <a:shade val="20000"/>
+                <a:satMod val="255000"/>
               </a:schemeClr>
             </a:gs>
           </a:gsLst>
-          <a:lin ang="5400000" scaled="0"/>
+          <a:path path="circle">
+            <a:fillToRect l="50000" t="-80000" r="50000" b="180000"/>
+          </a:path>
+        </a:gradFill>
+        <a:gradFill rotWithShape="1">
+          <a:gsLst>
+            <a:gs pos="0">
+              <a:schemeClr val="phClr">
+                <a:tint val="80000"/>
+                <a:satMod val="300000"/>
+              </a:schemeClr>
+            </a:gs>
+            <a:gs pos="100000">
+              <a:schemeClr val="phClr">
+                <a:shade val="30000"/>
+                <a:satMod val="200000"/>
+              </a:schemeClr>
+            </a:gs>
+          </a:gsLst>
+          <a:path path="circle">
+            <a:fillToRect l="50000" t="50000" r="50000" b="50000"/>
+          </a:path>
         </a:gradFill>
       </a:bgFillStyleLst>
     </a:fmtScheme>
   </a:themeElements>
-  <a:objectDefaults/>
+  <a:objectDefaults>
+    <a:spDef>
+      <a:spPr/>
+      <a:bodyPr/>
+      <a:lstStyle/>
+      <a:style>
+        <a:lnRef idx="1">
+          <a:schemeClr val="accent1"/>
+        </a:lnRef>
+        <a:fillRef idx="3">
+          <a:schemeClr val="accent1"/>
+        </a:fillRef>
+        <a:effectRef idx="2">
+          <a:schemeClr val="accent1"/>
+        </a:effectRef>
+        <a:fontRef idx="minor">
+          <a:schemeClr val="lt1"/>
+        </a:fontRef>
+      </a:style>
+    </a:spDef>
+    <a:lnDef>
+      <a:spPr/>
+      <a:bodyPr/>
+      <a:lstStyle/>
+      <a:style>
+        <a:lnRef idx="2">
+          <a:schemeClr val="accent1"/>
+        </a:lnRef>
+        <a:fillRef idx="0">
+          <a:schemeClr val="accent1"/>
+        </a:fillRef>
+        <a:effectRef idx="1">
+          <a:schemeClr val="accent1"/>
+        </a:effectRef>
+        <a:fontRef idx="minor">
+          <a:schemeClr val="tx1"/>
+        </a:fontRef>
+      </a:style>
+    </a:lnDef>
+  </a:objectDefaults>
   <a:extraClrSchemeLst/>
-  <a:extLst>
-    <a:ext uri="{05A4C25C-085E-4340-85A3-A5531E510DB2}">
-      <thm15:themeFamily xmlns:thm15="http://schemas.microsoft.com/office/thememl/2012/main" name="Office Theme" id="{2E142A2C-CD16-42D6-873A-C26D2A0506FA}" vid="{1BDDFF52-6CD6-40A5-AB3C-68EB2F1E4D0A}"/>
-    </a:ext>
-  </a:extLst>
 </a:theme>
 </file>
</xml_diff>